<commit_message>
tinggal tabel dan abstak
</commit_message>
<xml_diff>
--- a/Docs/BILA-BIMBINGAN-18.docx
+++ b/Docs/BILA-BIMBINGAN-18.docx
@@ -10180,7 +10180,7 @@
           <w:szCs w:val="24"/>
         </w:rPr>
         <w:drawing>
-          <wp:inline distT="0" distB="0" distL="0" distR="0" wp14:anchorId="579DEB6B" wp14:editId="64AF0A3B">
+          <wp:inline distT="0" distB="0" distL="0" distR="0" wp14:anchorId="579DEB6B" wp14:editId="65DAF98C">
             <wp:extent cx="2690908" cy="2457450"/>
             <wp:effectExtent l="0" t="0" r="0" b="0"/>
             <wp:docPr id="1749981188" name="Picture 2"/>
@@ -26477,6 +26477,107 @@
     </w:p>
     <w:p>
       <w:pPr>
+        <w:pStyle w:val="ListParagraph"/>
+        <w:spacing w:line="480" w:lineRule="auto"/>
+        <w:ind w:left="567" w:firstLine="851"/>
+        <w:rPr>
+          <w:lang w:val="fi-FI"/>
+        </w:rPr>
+      </w:pPr>
+      <w:r>
+        <w:rPr>
+          <w:lang w:val="fi-FI"/>
+        </w:rPr>
+        <w:t>Class Diagram merupakan deskripsi dari class-class yang ditangani oleh sistem, dimana tiap class dilengkapi dengan atribut dan operasional yang diperlukan.</w:t>
+      </w:r>
+    </w:p>
+    <w:p>
+      <w:pPr>
+        <w:pStyle w:val="ListParagraph"/>
+        <w:spacing w:line="480" w:lineRule="auto"/>
+        <w:ind w:left="567" w:firstLine="851"/>
+      </w:pPr>
+      <w:r>
+        <w:t xml:space="preserve">Berikut adalah class diagram Sistem dapat dilihat pada </w:t>
+      </w:r>
+      <w:r>
+        <w:t>gambar yang disertakan berikut</w:t>
+      </w:r>
+      <w:r>
+        <w:t>.</w:t>
+      </w:r>
+    </w:p>
+    <w:p>
+      <w:pPr>
+        <w:pStyle w:val="ListParagraph"/>
+        <w:spacing w:line="480" w:lineRule="auto"/>
+        <w:ind w:left="567" w:firstLine="851"/>
+      </w:pPr>
+      <w:r>
+        <w:lastRenderedPageBreak/>
+        <w:drawing>
+          <wp:inline distT="0" distB="0" distL="0" distR="0" wp14:anchorId="1D377E96" wp14:editId="53207118">
+            <wp:extent cx="4183380" cy="2765714"/>
+            <wp:effectExtent l="0" t="0" r="7620" b="0"/>
+            <wp:docPr id="502152021" name="Picture 4"/>
+            <wp:cNvGraphicFramePr>
+              <a:graphicFrameLocks xmlns:a="http://schemas.openxmlformats.org/drawingml/2006/main" noChangeAspect="1"/>
+            </wp:cNvGraphicFramePr>
+            <a:graphic xmlns:a="http://schemas.openxmlformats.org/drawingml/2006/main">
+              <a:graphicData uri="http://schemas.openxmlformats.org/drawingml/2006/picture">
+                <pic:pic xmlns:pic="http://schemas.openxmlformats.org/drawingml/2006/picture">
+                  <pic:nvPicPr>
+                    <pic:cNvPr id="0" name="Picture 1"/>
+                    <pic:cNvPicPr>
+                      <a:picLocks noChangeAspect="1" noChangeArrowheads="1"/>
+                    </pic:cNvPicPr>
+                  </pic:nvPicPr>
+                  <pic:blipFill>
+                    <a:blip r:embed="rId50">
+                      <a:extLst>
+                        <a:ext uri="{28A0092B-C50C-407E-A947-70E740481C1C}">
+                          <a14:useLocalDpi xmlns:a14="http://schemas.microsoft.com/office/drawing/2010/main" val="0"/>
+                        </a:ext>
+                      </a:extLst>
+                    </a:blip>
+                    <a:srcRect/>
+                    <a:stretch>
+                      <a:fillRect/>
+                    </a:stretch>
+                  </pic:blipFill>
+                  <pic:spPr bwMode="auto">
+                    <a:xfrm>
+                      <a:off x="0" y="0"/>
+                      <a:ext cx="4188145" cy="2768864"/>
+                    </a:xfrm>
+                    <a:prstGeom prst="rect">
+                      <a:avLst/>
+                    </a:prstGeom>
+                    <a:noFill/>
+                    <a:ln>
+                      <a:noFill/>
+                    </a:ln>
+                  </pic:spPr>
+                </pic:pic>
+              </a:graphicData>
+            </a:graphic>
+          </wp:inline>
+        </w:drawing>
+      </w:r>
+    </w:p>
+    <w:p>
+      <w:pPr>
+        <w:pStyle w:val="ListParagraph"/>
+        <w:spacing w:line="480" w:lineRule="auto"/>
+        <w:ind w:left="567" w:firstLine="851"/>
+        <w:jc w:val="center"/>
+      </w:pPr>
+      <w:r>
+        <w:t>Keterangan tabel</w:t>
+      </w:r>
+    </w:p>
+    <w:p>
+      <w:pPr>
         <w:pStyle w:val="Heading3"/>
         <w:rPr>
           <w:i/>
@@ -26490,6 +26591,1086 @@
         </w:rPr>
         <w:t>Activity Diagram</w:t>
       </w:r>
+    </w:p>
+    <w:p>
+      <w:pPr>
+        <w:pStyle w:val="ListParagraph"/>
+        <w:spacing w:line="480" w:lineRule="auto"/>
+        <w:ind w:left="567" w:firstLine="851"/>
+        <w:rPr>
+          <w:lang w:val="fi-FI"/>
+        </w:rPr>
+      </w:pPr>
+      <w:r>
+        <w:rPr>
+          <w:lang w:val="fi-FI"/>
+        </w:rPr>
+        <w:t>Activity Diagram adalah diagram untuk menggambarkan alur kerja (workflow) atau urutan aktivitas dalam suatu sistem. Berikut ini merupakan activity diagram pada sistem.</w:t>
+      </w:r>
+    </w:p>
+    <w:p>
+      <w:pPr>
+        <w:pStyle w:val="ListParagraph"/>
+        <w:numPr>
+          <w:ilvl w:val="6"/>
+          <w:numId w:val="1"/>
+        </w:numPr>
+        <w:spacing w:line="480" w:lineRule="auto"/>
+        <w:ind w:left="1701"/>
+        <w:rPr>
+          <w:lang w:val="fi-FI"/>
+        </w:rPr>
+      </w:pPr>
+      <w:r>
+        <w:rPr>
+          <w:lang w:val="fi-FI"/>
+        </w:rPr>
+        <w:t>Activity Diagram Login</w:t>
+      </w:r>
+    </w:p>
+    <w:p>
+      <w:pPr>
+        <w:pStyle w:val="ListParagraph"/>
+        <w:spacing w:line="480" w:lineRule="auto"/>
+        <w:ind w:left="1701" w:firstLine="459"/>
+        <w:rPr>
+          <w:lang w:val="fi-FI"/>
+        </w:rPr>
+      </w:pPr>
+      <w:r>
+        <w:rPr>
+          <w:lang w:val="fi-FI"/>
+        </w:rPr>
+        <w:t>Alur kerja dimulai saat pengguna (Pemilik</w:t>
+      </w:r>
+      <w:r>
+        <w:rPr>
+          <w:lang w:val="fi-FI"/>
+        </w:rPr>
+        <w:t xml:space="preserve"> dan</w:t>
+      </w:r>
+      <w:r>
+        <w:rPr>
+          <w:lang w:val="fi-FI"/>
+        </w:rPr>
+        <w:t xml:space="preserve"> Karyawan) membuka halaman </w:t>
+      </w:r>
+      <w:r>
+        <w:rPr>
+          <w:i/>
+          <w:iCs/>
+          <w:lang w:val="fi-FI"/>
+        </w:rPr>
+        <w:t>login</w:t>
+      </w:r>
+      <w:r>
+        <w:rPr>
+          <w:lang w:val="fi-FI"/>
+        </w:rPr>
+        <w:t xml:space="preserve">. Pengguna memasukkan </w:t>
+      </w:r>
+      <w:r>
+        <w:rPr>
+          <w:i/>
+          <w:iCs/>
+          <w:lang w:val="fi-FI"/>
+        </w:rPr>
+        <w:t>email</w:t>
+      </w:r>
+      <w:r>
+        <w:rPr>
+          <w:lang w:val="fi-FI"/>
+        </w:rPr>
+        <w:t xml:space="preserve"> dan </w:t>
+      </w:r>
+      <w:r>
+        <w:rPr>
+          <w:i/>
+          <w:iCs/>
+          <w:lang w:val="fi-FI"/>
+        </w:rPr>
+        <w:t>password</w:t>
+      </w:r>
+      <w:r>
+        <w:rPr>
+          <w:lang w:val="fi-FI"/>
+        </w:rPr>
+        <w:t>, kemudian sistem akan melakukan validasi kredensial tersebut. Jika data valid, sistem akan mengarahkan pengguna ke halaman dashboard sesuai dengan hak aksesnya</w:t>
+      </w:r>
+      <w:r>
+        <w:rPr>
+          <w:lang w:val="fi-FI"/>
+        </w:rPr>
+        <w:t>.</w:t>
+      </w:r>
+      <w:r>
+        <w:rPr>
+          <w:lang w:val="fi-FI"/>
+        </w:rPr>
+        <w:t xml:space="preserve"> </w:t>
+      </w:r>
+      <w:r>
+        <w:rPr>
+          <w:lang w:val="fi-FI"/>
+        </w:rPr>
+        <w:t xml:space="preserve">Jika tidak valid, sistem akan menampilkan pesan kesalahan dan pengguna tetap berada di halaman </w:t>
+      </w:r>
+      <w:r>
+        <w:rPr>
+          <w:i/>
+          <w:iCs/>
+          <w:lang w:val="fi-FI"/>
+        </w:rPr>
+        <w:t>login</w:t>
+      </w:r>
+      <w:r>
+        <w:rPr>
+          <w:lang w:val="fi-FI"/>
+        </w:rPr>
+        <w:t>.</w:t>
+      </w:r>
+    </w:p>
+    <w:p>
+      <w:pPr>
+        <w:pStyle w:val="ListParagraph"/>
+        <w:spacing w:line="480" w:lineRule="auto"/>
+        <w:ind w:left="1701" w:firstLine="459"/>
+        <w:jc w:val="center"/>
+        <w:rPr>
+          <w:lang w:val="fi-FI"/>
+        </w:rPr>
+      </w:pPr>
+      <w:r>
+        <w:rPr>
+          <w:lang w:val="fi-FI"/>
+        </w:rPr>
+        <w:lastRenderedPageBreak/>
+        <w:drawing>
+          <wp:inline distT="0" distB="0" distL="0" distR="0" wp14:anchorId="157EB900" wp14:editId="52CA6688">
+            <wp:extent cx="2989415" cy="3572934"/>
+            <wp:effectExtent l="0" t="0" r="1905" b="8890"/>
+            <wp:docPr id="1628036003" name="Picture 1"/>
+            <wp:cNvGraphicFramePr>
+              <a:graphicFrameLocks xmlns:a="http://schemas.openxmlformats.org/drawingml/2006/main" noChangeAspect="1"/>
+            </wp:cNvGraphicFramePr>
+            <a:graphic xmlns:a="http://schemas.openxmlformats.org/drawingml/2006/main">
+              <a:graphicData uri="http://schemas.openxmlformats.org/drawingml/2006/picture">
+                <pic:pic xmlns:pic="http://schemas.openxmlformats.org/drawingml/2006/picture">
+                  <pic:nvPicPr>
+                    <pic:cNvPr id="1628036003" name=""/>
+                    <pic:cNvPicPr/>
+                  </pic:nvPicPr>
+                  <pic:blipFill>
+                    <a:blip r:embed="rId51"/>
+                    <a:stretch>
+                      <a:fillRect/>
+                    </a:stretch>
+                  </pic:blipFill>
+                  <pic:spPr>
+                    <a:xfrm>
+                      <a:off x="0" y="0"/>
+                      <a:ext cx="2991854" cy="3575850"/>
+                    </a:xfrm>
+                    <a:prstGeom prst="rect">
+                      <a:avLst/>
+                    </a:prstGeom>
+                  </pic:spPr>
+                </pic:pic>
+              </a:graphicData>
+            </a:graphic>
+          </wp:inline>
+        </w:drawing>
+      </w:r>
+    </w:p>
+    <w:p>
+      <w:pPr>
+        <w:pStyle w:val="ListParagraph"/>
+        <w:numPr>
+          <w:ilvl w:val="6"/>
+          <w:numId w:val="1"/>
+        </w:numPr>
+        <w:spacing w:line="480" w:lineRule="auto"/>
+        <w:ind w:left="1701"/>
+        <w:rPr>
+          <w:lang w:val="fi-FI"/>
+        </w:rPr>
+      </w:pPr>
+      <w:r>
+        <w:rPr>
+          <w:lang w:val="fi-FI"/>
+        </w:rPr>
+        <w:t>Activity Diagram Checkout</w:t>
+      </w:r>
+    </w:p>
+    <w:p>
+      <w:pPr>
+        <w:pStyle w:val="ListParagraph"/>
+        <w:spacing w:line="480" w:lineRule="auto"/>
+        <w:ind w:left="1701"/>
+        <w:rPr>
+          <w:lang w:val="fi-FI"/>
+        </w:rPr>
+      </w:pPr>
+      <w:r>
+        <w:rPr>
+          <w:lang w:val="fi-FI"/>
+        </w:rPr>
+        <w:t xml:space="preserve">Diagram ini menggambarkan proses penyelesaian pesanan oleh pelanggan. Alur dimulai saat pelanggan menekan tombol </w:t>
+      </w:r>
+      <w:r>
+        <w:rPr>
+          <w:i/>
+          <w:iCs/>
+          <w:lang w:val="fi-FI"/>
+        </w:rPr>
+        <w:t>checkout</w:t>
+      </w:r>
+      <w:r>
+        <w:rPr>
+          <w:lang w:val="fi-FI"/>
+        </w:rPr>
+        <w:t>, mengisi identitas pemesan, memilih metode pembayaran</w:t>
+      </w:r>
+      <w:r>
+        <w:rPr>
+          <w:lang w:val="fi-FI"/>
+        </w:rPr>
+        <w:t xml:space="preserve"> langsung ke kasir</w:t>
+      </w:r>
+    </w:p>
+    <w:p>
+      <w:pPr>
+        <w:pStyle w:val="ListParagraph"/>
+        <w:spacing w:line="480" w:lineRule="auto"/>
+        <w:ind w:left="1701"/>
+        <w:rPr>
+          <w:lang w:val="fi-FI"/>
+        </w:rPr>
+      </w:pPr>
+      <w:r>
+        <w:rPr>
+          <w:lang w:val="fi-FI"/>
+        </w:rPr>
+        <w:t>, hingga sistem menyimpan data transaksi dan menampilkan notifikasi berhasil.</w:t>
+      </w:r>
+    </w:p>
+    <w:p>
+      <w:pPr>
+        <w:pStyle w:val="ListParagraph"/>
+        <w:spacing w:line="480" w:lineRule="auto"/>
+        <w:ind w:left="1701"/>
+        <w:jc w:val="center"/>
+        <w:rPr>
+          <w:lang w:val="fi-FI"/>
+        </w:rPr>
+      </w:pPr>
+      <w:r>
+        <w:lastRenderedPageBreak/>
+        <w:drawing>
+          <wp:inline distT="0" distB="0" distL="0" distR="0" wp14:anchorId="044A6090" wp14:editId="39CC43A0">
+            <wp:extent cx="2051456" cy="4919558"/>
+            <wp:effectExtent l="0" t="0" r="6350" b="0"/>
+            <wp:docPr id="1009675325" name="Picture 5"/>
+            <wp:cNvGraphicFramePr>
+              <a:graphicFrameLocks xmlns:a="http://schemas.openxmlformats.org/drawingml/2006/main" noChangeAspect="1"/>
+            </wp:cNvGraphicFramePr>
+            <a:graphic xmlns:a="http://schemas.openxmlformats.org/drawingml/2006/main">
+              <a:graphicData uri="http://schemas.openxmlformats.org/drawingml/2006/picture">
+                <pic:pic xmlns:pic="http://schemas.openxmlformats.org/drawingml/2006/picture">
+                  <pic:nvPicPr>
+                    <pic:cNvPr id="0" name="Picture 2"/>
+                    <pic:cNvPicPr>
+                      <a:picLocks noChangeAspect="1" noChangeArrowheads="1"/>
+                    </pic:cNvPicPr>
+                  </pic:nvPicPr>
+                  <pic:blipFill>
+                    <a:blip r:embed="rId52" cstate="print">
+                      <a:extLst>
+                        <a:ext uri="{28A0092B-C50C-407E-A947-70E740481C1C}">
+                          <a14:useLocalDpi xmlns:a14="http://schemas.microsoft.com/office/drawing/2010/main" val="0"/>
+                        </a:ext>
+                      </a:extLst>
+                    </a:blip>
+                    <a:srcRect/>
+                    <a:stretch>
+                      <a:fillRect/>
+                    </a:stretch>
+                  </pic:blipFill>
+                  <pic:spPr bwMode="auto">
+                    <a:xfrm>
+                      <a:off x="0" y="0"/>
+                      <a:ext cx="2055186" cy="4928502"/>
+                    </a:xfrm>
+                    <a:prstGeom prst="rect">
+                      <a:avLst/>
+                    </a:prstGeom>
+                  </pic:spPr>
+                </pic:pic>
+              </a:graphicData>
+            </a:graphic>
+          </wp:inline>
+        </w:drawing>
+      </w:r>
+    </w:p>
+    <w:p>
+      <w:pPr>
+        <w:pStyle w:val="ListParagraph"/>
+        <w:numPr>
+          <w:ilvl w:val="6"/>
+          <w:numId w:val="1"/>
+        </w:numPr>
+        <w:spacing w:line="480" w:lineRule="auto"/>
+        <w:ind w:left="1701"/>
+        <w:rPr>
+          <w:lang w:val="fi-FI"/>
+        </w:rPr>
+      </w:pPr>
+      <w:r>
+        <w:rPr>
+          <w:lang w:val="fi-FI"/>
+        </w:rPr>
+        <w:t>Activity Diagram Dashboard</w:t>
+      </w:r>
+    </w:p>
+    <w:p>
+      <w:pPr>
+        <w:pStyle w:val="ListParagraph"/>
+        <w:spacing w:line="480" w:lineRule="auto"/>
+        <w:ind w:left="1701"/>
+        <w:rPr>
+          <w:lang w:val="fi-FI"/>
+        </w:rPr>
+      </w:pPr>
+      <w:r>
+        <w:rPr>
+          <w:lang w:val="fi-FI"/>
+        </w:rPr>
+        <w:t xml:space="preserve">Diagram ini menunjukkan aktivitas sistem saat Admin berhasil </w:t>
+      </w:r>
+      <w:r>
+        <w:rPr>
+          <w:i/>
+          <w:iCs/>
+          <w:lang w:val="fi-FI"/>
+        </w:rPr>
+        <w:t>login</w:t>
+      </w:r>
+      <w:r>
+        <w:rPr>
+          <w:lang w:val="fi-FI"/>
+        </w:rPr>
+        <w:t xml:space="preserve">. Sistem secara otomatis memuat dan menampilkan ringkasan statistik operasional harian, seperti total omset penjualan dan jumlah pesanan yang masuk, dalam bentuk </w:t>
+      </w:r>
+      <w:r>
+        <w:rPr>
+          <w:i/>
+          <w:iCs/>
+          <w:lang w:val="fi-FI"/>
+        </w:rPr>
+        <w:t>widget</w:t>
+      </w:r>
+      <w:r>
+        <w:rPr>
+          <w:lang w:val="fi-FI"/>
+        </w:rPr>
+        <w:t xml:space="preserve"> informasi.</w:t>
+      </w:r>
+    </w:p>
+    <w:p>
+      <w:pPr>
+        <w:pStyle w:val="ListParagraph"/>
+        <w:spacing w:line="480" w:lineRule="auto"/>
+        <w:ind w:left="1701"/>
+        <w:jc w:val="center"/>
+        <w:rPr>
+          <w:lang w:val="fi-FI"/>
+        </w:rPr>
+      </w:pPr>
+      <w:r>
+        <w:lastRenderedPageBreak/>
+        <w:drawing>
+          <wp:inline distT="0" distB="0" distL="0" distR="0" wp14:anchorId="17961962" wp14:editId="0306E423">
+            <wp:extent cx="2290500" cy="3600000"/>
+            <wp:effectExtent l="0" t="0" r="0" b="635"/>
+            <wp:docPr id="427776955" name="Picture 6"/>
+            <wp:cNvGraphicFramePr>
+              <a:graphicFrameLocks xmlns:a="http://schemas.openxmlformats.org/drawingml/2006/main" noChangeAspect="1"/>
+            </wp:cNvGraphicFramePr>
+            <a:graphic xmlns:a="http://schemas.openxmlformats.org/drawingml/2006/main">
+              <a:graphicData uri="http://schemas.openxmlformats.org/drawingml/2006/picture">
+                <pic:pic xmlns:pic="http://schemas.openxmlformats.org/drawingml/2006/picture">
+                  <pic:nvPicPr>
+                    <pic:cNvPr id="0" name="Picture 4"/>
+                    <pic:cNvPicPr>
+                      <a:picLocks noChangeAspect="1" noChangeArrowheads="1"/>
+                    </pic:cNvPicPr>
+                  </pic:nvPicPr>
+                  <pic:blipFill>
+                    <a:blip r:embed="rId53">
+                      <a:extLst>
+                        <a:ext uri="{28A0092B-C50C-407E-A947-70E740481C1C}">
+                          <a14:useLocalDpi xmlns:a14="http://schemas.microsoft.com/office/drawing/2010/main" val="0"/>
+                        </a:ext>
+                      </a:extLst>
+                    </a:blip>
+                    <a:srcRect/>
+                    <a:stretch>
+                      <a:fillRect/>
+                    </a:stretch>
+                  </pic:blipFill>
+                  <pic:spPr bwMode="auto">
+                    <a:xfrm>
+                      <a:off x="0" y="0"/>
+                      <a:ext cx="2290500" cy="3600000"/>
+                    </a:xfrm>
+                    <a:prstGeom prst="rect">
+                      <a:avLst/>
+                    </a:prstGeom>
+                    <a:noFill/>
+                    <a:ln>
+                      <a:noFill/>
+                    </a:ln>
+                  </pic:spPr>
+                </pic:pic>
+              </a:graphicData>
+            </a:graphic>
+          </wp:inline>
+        </w:drawing>
+      </w:r>
+    </w:p>
+    <w:p>
+      <w:pPr>
+        <w:pStyle w:val="ListParagraph"/>
+        <w:numPr>
+          <w:ilvl w:val="6"/>
+          <w:numId w:val="1"/>
+        </w:numPr>
+        <w:spacing w:line="480" w:lineRule="auto"/>
+        <w:ind w:left="1701"/>
+        <w:rPr>
+          <w:lang w:val="fi-FI"/>
+        </w:rPr>
+      </w:pPr>
+      <w:r>
+        <w:rPr>
+          <w:lang w:val="fi-FI"/>
+        </w:rPr>
+        <w:t>Activity Diagram Daftar Meja</w:t>
+      </w:r>
+    </w:p>
+    <w:p>
+      <w:pPr>
+        <w:pStyle w:val="ListParagraph"/>
+        <w:spacing w:line="480" w:lineRule="auto"/>
+        <w:ind w:left="1701"/>
+        <w:rPr>
+          <w:lang w:val="fi-FI"/>
+        </w:rPr>
+      </w:pPr>
+      <w:r>
+        <w:rPr>
+          <w:lang w:val="fi-FI"/>
+        </w:rPr>
+        <w:t>Diagram ini menjelaskan alur pengelolaan data meja oleh Admin. Saat Admin menambahkan nomor meja baru, sistem secara otomatis akan men-</w:t>
+      </w:r>
+      <w:r>
+        <w:rPr>
+          <w:i/>
+          <w:iCs/>
+          <w:lang w:val="fi-FI"/>
+        </w:rPr>
+        <w:t>generate</w:t>
+      </w:r>
+      <w:r>
+        <w:rPr>
+          <w:lang w:val="fi-FI"/>
+        </w:rPr>
+        <w:t xml:space="preserve"> gambar QR Code unik yang berisi tautan pemesanan untuk meja tersebut agar siap dicetak.</w:t>
+      </w:r>
+    </w:p>
+    <w:p>
+      <w:pPr>
+        <w:spacing w:line="480" w:lineRule="auto"/>
+        <w:ind w:left="1701"/>
+        <w:jc w:val="center"/>
+        <w:rPr>
+          <w:lang w:val="fi-FI"/>
+        </w:rPr>
+      </w:pPr>
+      <w:r>
+        <w:lastRenderedPageBreak/>
+        <w:drawing>
+          <wp:inline distT="0" distB="0" distL="0" distR="0" wp14:anchorId="5A46D7DC" wp14:editId="790A00C6">
+            <wp:extent cx="2351405" cy="6375942"/>
+            <wp:effectExtent l="0" t="0" r="0" b="6350"/>
+            <wp:docPr id="91620242" name="Picture 11"/>
+            <wp:cNvGraphicFramePr>
+              <a:graphicFrameLocks xmlns:a="http://schemas.openxmlformats.org/drawingml/2006/main" noChangeAspect="1"/>
+            </wp:cNvGraphicFramePr>
+            <a:graphic xmlns:a="http://schemas.openxmlformats.org/drawingml/2006/main">
+              <a:graphicData uri="http://schemas.openxmlformats.org/drawingml/2006/picture">
+                <pic:pic xmlns:pic="http://schemas.openxmlformats.org/drawingml/2006/picture">
+                  <pic:nvPicPr>
+                    <pic:cNvPr id="0" name="Picture 14"/>
+                    <pic:cNvPicPr>
+                      <a:picLocks noChangeAspect="1" noChangeArrowheads="1"/>
+                    </pic:cNvPicPr>
+                  </pic:nvPicPr>
+                  <pic:blipFill>
+                    <a:blip r:embed="rId54">
+                      <a:extLst>
+                        <a:ext uri="{28A0092B-C50C-407E-A947-70E740481C1C}">
+                          <a14:useLocalDpi xmlns:a14="http://schemas.microsoft.com/office/drawing/2010/main" val="0"/>
+                        </a:ext>
+                      </a:extLst>
+                    </a:blip>
+                    <a:srcRect/>
+                    <a:stretch>
+                      <a:fillRect/>
+                    </a:stretch>
+                  </pic:blipFill>
+                  <pic:spPr bwMode="auto">
+                    <a:xfrm>
+                      <a:off x="0" y="0"/>
+                      <a:ext cx="2355362" cy="6386672"/>
+                    </a:xfrm>
+                    <a:prstGeom prst="rect">
+                      <a:avLst/>
+                    </a:prstGeom>
+                    <a:noFill/>
+                    <a:ln>
+                      <a:noFill/>
+                    </a:ln>
+                  </pic:spPr>
+                </pic:pic>
+              </a:graphicData>
+            </a:graphic>
+          </wp:inline>
+        </w:drawing>
+      </w:r>
+    </w:p>
+    <w:p>
+      <w:pPr>
+        <w:pStyle w:val="ListParagraph"/>
+        <w:numPr>
+          <w:ilvl w:val="6"/>
+          <w:numId w:val="1"/>
+        </w:numPr>
+        <w:spacing w:line="480" w:lineRule="auto"/>
+        <w:ind w:left="1701"/>
+        <w:rPr>
+          <w:lang w:val="fi-FI"/>
+        </w:rPr>
+      </w:pPr>
+      <w:r>
+        <w:rPr>
+          <w:lang w:val="fi-FI"/>
+        </w:rPr>
+        <w:t>Activity Diagram Pesanan</w:t>
+      </w:r>
+    </w:p>
+    <w:p>
+      <w:pPr>
+        <w:pStyle w:val="ListParagraph"/>
+        <w:spacing w:line="480" w:lineRule="auto"/>
+        <w:ind w:left="1701"/>
+      </w:pPr>
+      <w:r>
+        <w:rPr>
+          <w:lang w:val="fi-FI"/>
+        </w:rPr>
+        <w:t xml:space="preserve">Diagram ini mengilustrasikan aktivitas Admin/Kasir dalam memproses pesanan masuk. </w:t>
+      </w:r>
+      <w:r>
+        <w:t>Admin melihat detail pesanan, dan mengubah status pesanan menjadi "Sedang Diproses" agar data diteruskan ke bagian dapur.</w:t>
+      </w:r>
+    </w:p>
+    <w:p>
+      <w:pPr>
+        <w:pStyle w:val="ListParagraph"/>
+        <w:spacing w:line="480" w:lineRule="auto"/>
+        <w:ind w:left="1701"/>
+        <w:jc w:val="center"/>
+        <w:rPr>
+          <w:lang w:val="fi-FI"/>
+        </w:rPr>
+      </w:pPr>
+      <w:r>
+        <w:lastRenderedPageBreak/>
+        <w:drawing>
+          <wp:inline distT="0" distB="0" distL="0" distR="0" wp14:anchorId="2E036923" wp14:editId="0DAB419E">
+            <wp:extent cx="2438400" cy="5966870"/>
+            <wp:effectExtent l="0" t="0" r="0" b="0"/>
+            <wp:docPr id="975026053" name="Picture 7"/>
+            <wp:cNvGraphicFramePr>
+              <a:graphicFrameLocks xmlns:a="http://schemas.openxmlformats.org/drawingml/2006/main" noChangeAspect="1"/>
+            </wp:cNvGraphicFramePr>
+            <a:graphic xmlns:a="http://schemas.openxmlformats.org/drawingml/2006/main">
+              <a:graphicData uri="http://schemas.openxmlformats.org/drawingml/2006/picture">
+                <pic:pic xmlns:pic="http://schemas.openxmlformats.org/drawingml/2006/picture">
+                  <pic:nvPicPr>
+                    <pic:cNvPr id="0" name="Picture 6"/>
+                    <pic:cNvPicPr>
+                      <a:picLocks noChangeAspect="1" noChangeArrowheads="1"/>
+                    </pic:cNvPicPr>
+                  </pic:nvPicPr>
+                  <pic:blipFill>
+                    <a:blip r:embed="rId55">
+                      <a:extLst>
+                        <a:ext uri="{28A0092B-C50C-407E-A947-70E740481C1C}">
+                          <a14:useLocalDpi xmlns:a14="http://schemas.microsoft.com/office/drawing/2010/main" val="0"/>
+                        </a:ext>
+                      </a:extLst>
+                    </a:blip>
+                    <a:srcRect/>
+                    <a:stretch>
+                      <a:fillRect/>
+                    </a:stretch>
+                  </pic:blipFill>
+                  <pic:spPr bwMode="auto">
+                    <a:xfrm>
+                      <a:off x="0" y="0"/>
+                      <a:ext cx="2450509" cy="5996500"/>
+                    </a:xfrm>
+                    <a:prstGeom prst="rect">
+                      <a:avLst/>
+                    </a:prstGeom>
+                    <a:noFill/>
+                    <a:ln>
+                      <a:noFill/>
+                    </a:ln>
+                  </pic:spPr>
+                </pic:pic>
+              </a:graphicData>
+            </a:graphic>
+          </wp:inline>
+        </w:drawing>
+      </w:r>
+    </w:p>
+    <w:p>
+      <w:pPr>
+        <w:pStyle w:val="ListParagraph"/>
+        <w:numPr>
+          <w:ilvl w:val="6"/>
+          <w:numId w:val="1"/>
+        </w:numPr>
+        <w:spacing w:line="480" w:lineRule="auto"/>
+        <w:ind w:left="1701"/>
+        <w:rPr>
+          <w:lang w:val="fi-FI"/>
+        </w:rPr>
+      </w:pPr>
+      <w:r>
+        <w:rPr>
+          <w:lang w:val="fi-FI"/>
+        </w:rPr>
+        <w:t>Activity Diagram Daftar Menu</w:t>
+      </w:r>
+    </w:p>
+    <w:p>
+      <w:pPr>
+        <w:pStyle w:val="ListParagraph"/>
+        <w:spacing w:line="480" w:lineRule="auto"/>
+        <w:ind w:left="1701"/>
+      </w:pPr>
+      <w:r>
+        <w:t>Diagram ini menggambarkan proses pengelolaan data master produk (</w:t>
+      </w:r>
+      <w:r>
+        <w:rPr>
+          <w:i/>
+          <w:iCs/>
+        </w:rPr>
+        <w:t>CRUD</w:t>
+      </w:r>
+      <w:r>
+        <w:t>). Admin melakukan aktivitas menambah, mengubah, atau menghapus data menu makanan dan minuman, termasuk mengunggah foto produk dan mengatur harga.</w:t>
+      </w:r>
+    </w:p>
+    <w:p>
+      <w:pPr>
+        <w:spacing w:line="480" w:lineRule="auto"/>
+        <w:ind w:left="2127"/>
+        <w:jc w:val="center"/>
+        <w:rPr>
+          <w:lang w:val="fi-FI"/>
+        </w:rPr>
+      </w:pPr>
+      <w:r>
+        <w:lastRenderedPageBreak/>
+        <w:drawing>
+          <wp:inline distT="0" distB="0" distL="0" distR="0" wp14:anchorId="32DAB143" wp14:editId="2A01064E">
+            <wp:extent cx="2287905" cy="6208993"/>
+            <wp:effectExtent l="0" t="0" r="0" b="1905"/>
+            <wp:docPr id="273136186" name="Picture 8"/>
+            <wp:cNvGraphicFramePr>
+              <a:graphicFrameLocks xmlns:a="http://schemas.openxmlformats.org/drawingml/2006/main" noChangeAspect="1"/>
+            </wp:cNvGraphicFramePr>
+            <a:graphic xmlns:a="http://schemas.openxmlformats.org/drawingml/2006/main">
+              <a:graphicData uri="http://schemas.openxmlformats.org/drawingml/2006/picture">
+                <pic:pic xmlns:pic="http://schemas.openxmlformats.org/drawingml/2006/picture">
+                  <pic:nvPicPr>
+                    <pic:cNvPr id="0" name="Picture 8"/>
+                    <pic:cNvPicPr>
+                      <a:picLocks noChangeAspect="1" noChangeArrowheads="1"/>
+                    </pic:cNvPicPr>
+                  </pic:nvPicPr>
+                  <pic:blipFill>
+                    <a:blip r:embed="rId56">
+                      <a:extLst>
+                        <a:ext uri="{28A0092B-C50C-407E-A947-70E740481C1C}">
+                          <a14:useLocalDpi xmlns:a14="http://schemas.microsoft.com/office/drawing/2010/main" val="0"/>
+                        </a:ext>
+                      </a:extLst>
+                    </a:blip>
+                    <a:srcRect/>
+                    <a:stretch>
+                      <a:fillRect/>
+                    </a:stretch>
+                  </pic:blipFill>
+                  <pic:spPr bwMode="auto">
+                    <a:xfrm>
+                      <a:off x="0" y="0"/>
+                      <a:ext cx="2297861" cy="6236013"/>
+                    </a:xfrm>
+                    <a:prstGeom prst="rect">
+                      <a:avLst/>
+                    </a:prstGeom>
+                    <a:noFill/>
+                    <a:ln>
+                      <a:noFill/>
+                    </a:ln>
+                  </pic:spPr>
+                </pic:pic>
+              </a:graphicData>
+            </a:graphic>
+          </wp:inline>
+        </w:drawing>
+      </w:r>
+    </w:p>
+    <w:p>
+      <w:pPr>
+        <w:pStyle w:val="ListParagraph"/>
+        <w:numPr>
+          <w:ilvl w:val="6"/>
+          <w:numId w:val="1"/>
+        </w:numPr>
+        <w:spacing w:line="480" w:lineRule="auto"/>
+        <w:ind w:left="1701"/>
+        <w:rPr>
+          <w:lang w:val="fi-FI"/>
+        </w:rPr>
+      </w:pPr>
+      <w:r>
+        <w:rPr>
+          <w:lang w:val="fi-FI"/>
+        </w:rPr>
+        <w:t>Activity Diagram Kategori Menu</w:t>
+      </w:r>
+    </w:p>
+    <w:p>
+      <w:pPr>
+        <w:pStyle w:val="ListParagraph"/>
+        <w:spacing w:line="480" w:lineRule="auto"/>
+        <w:ind w:left="1701"/>
+        <w:rPr>
+          <w:lang w:val="fi-FI"/>
+        </w:rPr>
+      </w:pPr>
+      <w:r>
+        <w:rPr>
+          <w:lang w:val="fi-FI"/>
+        </w:rPr>
+        <w:t xml:space="preserve">Diagram ini menunjukkan alur pengelompokan jenis menu. Admin dapat membuat kategori baru (misalnya: Makanan, Minuman, </w:t>
+      </w:r>
+      <w:r>
+        <w:rPr>
+          <w:i/>
+          <w:iCs/>
+          <w:lang w:val="fi-FI"/>
+        </w:rPr>
+        <w:t>Snack</w:t>
+      </w:r>
+      <w:r>
+        <w:rPr>
+          <w:lang w:val="fi-FI"/>
+        </w:rPr>
+        <w:t>) untuk memudahkan sistem memfilter tampilan menu di halaman pelanggan.</w:t>
+      </w:r>
+    </w:p>
+    <w:p>
+      <w:pPr>
+        <w:pStyle w:val="ListParagraph"/>
+        <w:spacing w:line="480" w:lineRule="auto"/>
+        <w:ind w:left="1701"/>
+        <w:jc w:val="center"/>
+        <w:rPr>
+          <w:lang w:val="fi-FI"/>
+        </w:rPr>
+      </w:pPr>
+      <w:r>
+        <w:lastRenderedPageBreak/>
+        <w:drawing>
+          <wp:inline distT="0" distB="0" distL="0" distR="0" wp14:anchorId="6A2F6C20" wp14:editId="0AAB2D92">
+            <wp:extent cx="2441861" cy="6403975"/>
+            <wp:effectExtent l="0" t="0" r="0" b="0"/>
+            <wp:docPr id="1980706562" name="Picture 9"/>
+            <wp:cNvGraphicFramePr>
+              <a:graphicFrameLocks xmlns:a="http://schemas.openxmlformats.org/drawingml/2006/main" noChangeAspect="1"/>
+            </wp:cNvGraphicFramePr>
+            <a:graphic xmlns:a="http://schemas.openxmlformats.org/drawingml/2006/main">
+              <a:graphicData uri="http://schemas.openxmlformats.org/drawingml/2006/picture">
+                <pic:pic xmlns:pic="http://schemas.openxmlformats.org/drawingml/2006/picture">
+                  <pic:nvPicPr>
+                    <pic:cNvPr id="0" name="Picture 10"/>
+                    <pic:cNvPicPr>
+                      <a:picLocks noChangeAspect="1" noChangeArrowheads="1"/>
+                    </pic:cNvPicPr>
+                  </pic:nvPicPr>
+                  <pic:blipFill>
+                    <a:blip r:embed="rId57">
+                      <a:extLst>
+                        <a:ext uri="{28A0092B-C50C-407E-A947-70E740481C1C}">
+                          <a14:useLocalDpi xmlns:a14="http://schemas.microsoft.com/office/drawing/2010/main" val="0"/>
+                        </a:ext>
+                      </a:extLst>
+                    </a:blip>
+                    <a:srcRect/>
+                    <a:stretch>
+                      <a:fillRect/>
+                    </a:stretch>
+                  </pic:blipFill>
+                  <pic:spPr bwMode="auto">
+                    <a:xfrm>
+                      <a:off x="0" y="0"/>
+                      <a:ext cx="2445425" cy="6413323"/>
+                    </a:xfrm>
+                    <a:prstGeom prst="rect">
+                      <a:avLst/>
+                    </a:prstGeom>
+                    <a:noFill/>
+                    <a:ln>
+                      <a:noFill/>
+                    </a:ln>
+                  </pic:spPr>
+                </pic:pic>
+              </a:graphicData>
+            </a:graphic>
+          </wp:inline>
+        </w:drawing>
+      </w:r>
+    </w:p>
+    <w:p>
+      <w:pPr>
+        <w:pStyle w:val="ListParagraph"/>
+        <w:numPr>
+          <w:ilvl w:val="6"/>
+          <w:numId w:val="1"/>
+        </w:numPr>
+        <w:spacing w:line="480" w:lineRule="auto"/>
+        <w:ind w:left="1701"/>
+        <w:rPr>
+          <w:lang w:val="fi-FI"/>
+        </w:rPr>
+      </w:pPr>
+      <w:r>
+        <w:rPr>
+          <w:lang w:val="fi-FI"/>
+        </w:rPr>
+        <w:t>Activity Diagram Laporan Penjualan</w:t>
+      </w:r>
+    </w:p>
+    <w:p>
+      <w:pPr>
+        <w:pStyle w:val="ListParagraph"/>
+        <w:spacing w:line="480" w:lineRule="auto"/>
+        <w:ind w:left="1701"/>
+        <w:rPr>
+          <w:lang w:val="fi-FI"/>
+        </w:rPr>
+      </w:pPr>
+      <w:r>
+        <w:rPr>
+          <w:lang w:val="fi-FI"/>
+        </w:rPr>
+        <w:t>Diagram ini menjelaskan aktivitas pelaporan keuangan. Admin memilih filter rentang tanggal tertentu, dan sistem akan melakukan kueri data pesanan yang berstatus "Selesai" untuk menampilkan tabel rekapitulasi pendapatan</w:t>
+      </w:r>
+    </w:p>
+    <w:p>
+      <w:pPr>
+        <w:pStyle w:val="ListParagraph"/>
+        <w:spacing w:line="480" w:lineRule="auto"/>
+        <w:ind w:left="1701"/>
+        <w:jc w:val="center"/>
+        <w:rPr>
+          <w:lang w:val="fi-FI"/>
+        </w:rPr>
+      </w:pPr>
+      <w:r>
+        <w:lastRenderedPageBreak/>
+        <w:drawing>
+          <wp:inline distT="0" distB="0" distL="0" distR="0" wp14:anchorId="7981302C" wp14:editId="6C21F5C1">
+            <wp:extent cx="2372757" cy="4091940"/>
+            <wp:effectExtent l="0" t="0" r="8890" b="3810"/>
+            <wp:docPr id="791268260" name="Picture 10"/>
+            <wp:cNvGraphicFramePr>
+              <a:graphicFrameLocks xmlns:a="http://schemas.openxmlformats.org/drawingml/2006/main" noChangeAspect="1"/>
+            </wp:cNvGraphicFramePr>
+            <a:graphic xmlns:a="http://schemas.openxmlformats.org/drawingml/2006/main">
+              <a:graphicData uri="http://schemas.openxmlformats.org/drawingml/2006/picture">
+                <pic:pic xmlns:pic="http://schemas.openxmlformats.org/drawingml/2006/picture">
+                  <pic:nvPicPr>
+                    <pic:cNvPr id="0" name="Picture 12"/>
+                    <pic:cNvPicPr>
+                      <a:picLocks noChangeAspect="1" noChangeArrowheads="1"/>
+                    </pic:cNvPicPr>
+                  </pic:nvPicPr>
+                  <pic:blipFill>
+                    <a:blip r:embed="rId58">
+                      <a:extLst>
+                        <a:ext uri="{28A0092B-C50C-407E-A947-70E740481C1C}">
+                          <a14:useLocalDpi xmlns:a14="http://schemas.microsoft.com/office/drawing/2010/main" val="0"/>
+                        </a:ext>
+                      </a:extLst>
+                    </a:blip>
+                    <a:srcRect/>
+                    <a:stretch>
+                      <a:fillRect/>
+                    </a:stretch>
+                  </pic:blipFill>
+                  <pic:spPr bwMode="auto">
+                    <a:xfrm>
+                      <a:off x="0" y="0"/>
+                      <a:ext cx="2376610" cy="4098584"/>
+                    </a:xfrm>
+                    <a:prstGeom prst="rect">
+                      <a:avLst/>
+                    </a:prstGeom>
+                    <a:noFill/>
+                    <a:ln>
+                      <a:noFill/>
+                    </a:ln>
+                  </pic:spPr>
+                </pic:pic>
+              </a:graphicData>
+            </a:graphic>
+          </wp:inline>
+        </w:drawing>
+      </w:r>
+    </w:p>
+    <w:p>
+      <w:pPr>
+        <w:pStyle w:val="ListParagraph"/>
+        <w:numPr>
+          <w:ilvl w:val="6"/>
+          <w:numId w:val="1"/>
+        </w:numPr>
+        <w:spacing w:line="480" w:lineRule="auto"/>
+        <w:ind w:left="1701"/>
+      </w:pPr>
+      <w:r>
+        <w:t>Activity Diagram Meja Kerja K</w:t>
+      </w:r>
+      <w:r>
+        <w:t>aryawan</w:t>
+      </w:r>
+    </w:p>
+    <w:p>
+      <w:pPr>
+        <w:pStyle w:val="ListParagraph"/>
+        <w:spacing w:line="480" w:lineRule="auto"/>
+        <w:ind w:left="1701"/>
+      </w:pPr>
+      <w:r>
+        <w:t xml:space="preserve">Diagram ini menggambarkan alur kerja pada fitur </w:t>
+      </w:r>
+      <w:r>
+        <w:rPr>
+          <w:i/>
+          <w:iCs/>
+        </w:rPr>
+        <w:t>Kitchen Display System</w:t>
+      </w:r>
+      <w:r>
+        <w:t xml:space="preserve">. Staf dapur memantau daftar pesanan yang perlu dimasak secara </w:t>
+      </w:r>
+      <w:r>
+        <w:rPr>
+          <w:i/>
+          <w:iCs/>
+        </w:rPr>
+        <w:t>real-time</w:t>
+      </w:r>
+      <w:r>
+        <w:t xml:space="preserve"> dan menekan tombol "Selesai" ketika makanan telah siap untuk disajikan ke pelanggan.</w:t>
+      </w:r>
+    </w:p>
+    <w:p>
+      <w:pPr>
+        <w:pStyle w:val="ListParagraph"/>
+        <w:spacing w:line="480" w:lineRule="auto"/>
+        <w:ind w:left="1701"/>
+        <w:jc w:val="center"/>
+      </w:pPr>
+      <w:r>
+        <w:lastRenderedPageBreak/>
+        <w:drawing>
+          <wp:inline distT="0" distB="0" distL="0" distR="0" wp14:anchorId="5F2C6586" wp14:editId="5F92B540">
+            <wp:extent cx="2210435" cy="5356070"/>
+            <wp:effectExtent l="0" t="0" r="0" b="0"/>
+            <wp:docPr id="1426226284" name="Picture 12"/>
+            <wp:cNvGraphicFramePr>
+              <a:graphicFrameLocks xmlns:a="http://schemas.openxmlformats.org/drawingml/2006/main" noChangeAspect="1"/>
+            </wp:cNvGraphicFramePr>
+            <a:graphic xmlns:a="http://schemas.openxmlformats.org/drawingml/2006/main">
+              <a:graphicData uri="http://schemas.openxmlformats.org/drawingml/2006/picture">
+                <pic:pic xmlns:pic="http://schemas.openxmlformats.org/drawingml/2006/picture">
+                  <pic:nvPicPr>
+                    <pic:cNvPr id="0" name="Picture 16"/>
+                    <pic:cNvPicPr>
+                      <a:picLocks noChangeAspect="1" noChangeArrowheads="1"/>
+                    </pic:cNvPicPr>
+                  </pic:nvPicPr>
+                  <pic:blipFill>
+                    <a:blip r:embed="rId59">
+                      <a:extLst>
+                        <a:ext uri="{28A0092B-C50C-407E-A947-70E740481C1C}">
+                          <a14:useLocalDpi xmlns:a14="http://schemas.microsoft.com/office/drawing/2010/main" val="0"/>
+                        </a:ext>
+                      </a:extLst>
+                    </a:blip>
+                    <a:srcRect/>
+                    <a:stretch>
+                      <a:fillRect/>
+                    </a:stretch>
+                  </pic:blipFill>
+                  <pic:spPr bwMode="auto">
+                    <a:xfrm>
+                      <a:off x="0" y="0"/>
+                      <a:ext cx="2214378" cy="5365625"/>
+                    </a:xfrm>
+                    <a:prstGeom prst="rect">
+                      <a:avLst/>
+                    </a:prstGeom>
+                    <a:noFill/>
+                    <a:ln>
+                      <a:noFill/>
+                    </a:ln>
+                  </pic:spPr>
+                </pic:pic>
+              </a:graphicData>
+            </a:graphic>
+          </wp:inline>
+        </w:drawing>
+      </w:r>
+    </w:p>
+    <w:p>
+      <w:pPr>
+        <w:pStyle w:val="ListParagraph"/>
+        <w:spacing w:line="480" w:lineRule="auto"/>
+        <w:ind w:left="1701"/>
+        <w:jc w:val="center"/>
+      </w:pPr>
     </w:p>
     <w:p>
       <w:pPr>
@@ -26530,6 +27711,7 @@
         <w:spacing w:line="480" w:lineRule="auto"/>
       </w:pPr>
       <w:r>
+        <w:lastRenderedPageBreak/>
         <w:t>Halaman Login</w:t>
       </w:r>
     </w:p>
@@ -26546,14 +27728,7 @@
         <w:rPr>
           <w:lang w:val="fi-FI"/>
         </w:rPr>
-        <w:t xml:space="preserve">Antarmukanya didesain </w:t>
-      </w:r>
-      <w:r>
-        <w:rPr>
-          <w:lang w:val="fi-FI"/>
-        </w:rPr>
-        <w:lastRenderedPageBreak/>
-        <w:t xml:space="preserve">sederhana, hanya meminta kredensial berupa email dan kata sandi. Setelah berhasil diautentikasi, sistem akan mengarahkan pengguna ke halaman </w:t>
+        <w:t xml:space="preserve">Antarmukanya didesain sederhana, hanya meminta kredensial berupa email dan kata sandi. Setelah berhasil diautentikasi, sistem akan mengarahkan pengguna ke halaman </w:t>
       </w:r>
       <w:r>
         <w:rPr>
@@ -26622,7 +27797,14 @@
         <w:rPr>
           <w:lang w:val="fi-FI"/>
         </w:rPr>
-        <w:t xml:space="preserve">Setelah Pelanggan selesai memilih pesanan, mereka akan diarahkan ke halaman ini untuk menyelesaikan transaksi. Halaman ini akan menampilkan rincian pesanan beserta total harga yang harus dibayar </w:t>
+        <w:t xml:space="preserve">Setelah Pelanggan selesai memilih pesanan, mereka akan diarahkan ke halaman ini untuk menyelesaikan transaksi. Halaman ini akan menampilkan rincian pesanan beserta total </w:t>
+      </w:r>
+      <w:r>
+        <w:rPr>
+          <w:lang w:val="fi-FI"/>
+        </w:rPr>
+        <w:lastRenderedPageBreak/>
+        <w:t xml:space="preserve">harga yang harus dibayar </w:t>
       </w:r>
       <w:r>
         <w:rPr>
@@ -27159,7 +28341,7 @@
                     <pic:cNvPicPr/>
                   </pic:nvPicPr>
                   <pic:blipFill>
-                    <a:blip r:embed="rId50"/>
+                    <a:blip r:embed="rId60"/>
                     <a:stretch>
                       <a:fillRect/>
                     </a:stretch>
@@ -27322,7 +28504,7 @@
                     <pic:cNvPicPr/>
                   </pic:nvPicPr>
                   <pic:blipFill>
-                    <a:blip r:embed="rId51"/>
+                    <a:blip r:embed="rId61"/>
                     <a:stretch>
                       <a:fillRect/>
                     </a:stretch>
@@ -27476,7 +28658,7 @@
                     <pic:cNvPicPr/>
                   </pic:nvPicPr>
                   <pic:blipFill>
-                    <a:blip r:embed="rId52"/>
+                    <a:blip r:embed="rId62"/>
                     <a:stretch>
                       <a:fillRect/>
                     </a:stretch>
@@ -27627,7 +28809,7 @@
                     <pic:cNvPicPr/>
                   </pic:nvPicPr>
                   <pic:blipFill>
-                    <a:blip r:embed="rId53"/>
+                    <a:blip r:embed="rId63"/>
                     <a:stretch>
                       <a:fillRect/>
                     </a:stretch>
@@ -27761,7 +28943,7 @@
                     <pic:cNvPicPr/>
                   </pic:nvPicPr>
                   <pic:blipFill>
-                    <a:blip r:embed="rId54"/>
+                    <a:blip r:embed="rId64"/>
                     <a:stretch>
                       <a:fillRect/>
                     </a:stretch>
@@ -27998,7 +29180,7 @@
                     <pic:cNvPicPr/>
                   </pic:nvPicPr>
                   <pic:blipFill>
-                    <a:blip r:embed="rId55"/>
+                    <a:blip r:embed="rId65"/>
                     <a:stretch>
                       <a:fillRect/>
                     </a:stretch>
@@ -28138,7 +29320,7 @@
                     <pic:cNvPicPr/>
                   </pic:nvPicPr>
                   <pic:blipFill>
-                    <a:blip r:embed="rId56"/>
+                    <a:blip r:embed="rId66"/>
                     <a:stretch>
                       <a:fillRect/>
                     </a:stretch>
@@ -28251,7 +29433,7 @@
                     <pic:cNvPicPr/>
                   </pic:nvPicPr>
                   <pic:blipFill>
-                    <a:blip r:embed="rId57"/>
+                    <a:blip r:embed="rId67"/>
                     <a:stretch>
                       <a:fillRect/>
                     </a:stretch>
@@ -28434,7 +29616,7 @@
                     <pic:cNvPicPr/>
                   </pic:nvPicPr>
                   <pic:blipFill>
-                    <a:blip r:embed="rId58"/>
+                    <a:blip r:embed="rId68"/>
                     <a:stretch>
                       <a:fillRect/>
                     </a:stretch>
@@ -28585,7 +29767,7 @@
                     <pic:cNvPicPr/>
                   </pic:nvPicPr>
                   <pic:blipFill>
-                    <a:blip r:embed="rId59"/>
+                    <a:blip r:embed="rId69"/>
                     <a:stretch>
                       <a:fillRect/>
                     </a:stretch>
@@ -28713,7 +29895,7 @@
                     <pic:cNvPicPr/>
                   </pic:nvPicPr>
                   <pic:blipFill>
-                    <a:blip r:embed="rId60"/>
+                    <a:blip r:embed="rId70"/>
                     <a:stretch>
                       <a:fillRect/>
                     </a:stretch>
@@ -28834,7 +30016,7 @@
                     <pic:cNvPicPr/>
                   </pic:nvPicPr>
                   <pic:blipFill>
-                    <a:blip r:embed="rId61"/>
+                    <a:blip r:embed="rId71"/>
                     <a:stretch>
                       <a:fillRect/>
                     </a:stretch>
@@ -28958,7 +30140,7 @@
                     <pic:cNvPicPr/>
                   </pic:nvPicPr>
                   <pic:blipFill>
-                    <a:blip r:embed="rId62"/>
+                    <a:blip r:embed="rId72"/>
                     <a:stretch>
                       <a:fillRect/>
                     </a:stretch>
@@ -29102,7 +30284,7 @@
                     <pic:cNvPicPr/>
                   </pic:nvPicPr>
                   <pic:blipFill>
-                    <a:blip r:embed="rId63"/>
+                    <a:blip r:embed="rId73"/>
                     <a:stretch>
                       <a:fillRect/>
                     </a:stretch>
@@ -29226,7 +30408,7 @@
                     <pic:cNvPicPr/>
                   </pic:nvPicPr>
                   <pic:blipFill>
-                    <a:blip r:embed="rId64"/>
+                    <a:blip r:embed="rId74"/>
                     <a:stretch>
                       <a:fillRect/>
                     </a:stretch>
@@ -29377,7 +30559,7 @@
                     <pic:cNvPicPr/>
                   </pic:nvPicPr>
                   <pic:blipFill>
-                    <a:blip r:embed="rId65"/>
+                    <a:blip r:embed="rId75"/>
                     <a:stretch>
                       <a:fillRect/>
                     </a:stretch>
@@ -29508,7 +30690,7 @@
                     <pic:cNvPicPr/>
                   </pic:nvPicPr>
                   <pic:blipFill>
-                    <a:blip r:embed="rId66"/>
+                    <a:blip r:embed="rId76"/>
                     <a:stretch>
                       <a:fillRect/>
                     </a:stretch>
@@ -32188,7 +33370,7 @@
                           <pic:cNvPicPr/>
                         </pic:nvPicPr>
                         <pic:blipFill>
-                          <a:blip r:embed="rId67"/>
+                          <a:blip r:embed="rId77"/>
                           <a:stretch>
                             <a:fillRect/>
                           </a:stretch>
@@ -32927,7 +34109,7 @@
                           <pic:cNvPicPr/>
                         </pic:nvPicPr>
                         <pic:blipFill>
-                          <a:blip r:embed="rId68"/>
+                          <a:blip r:embed="rId78"/>
                           <a:stretch>
                             <a:fillRect/>
                           </a:stretch>
@@ -33670,7 +34852,7 @@
                           <pic:cNvPicPr/>
                         </pic:nvPicPr>
                         <pic:blipFill>
-                          <a:blip r:embed="rId69"/>
+                          <a:blip r:embed="rId79"/>
                           <a:stretch>
                             <a:fillRect/>
                           </a:stretch>
@@ -34401,7 +35583,7 @@
                           <pic:cNvPicPr/>
                         </pic:nvPicPr>
                         <pic:blipFill>
-                          <a:blip r:embed="rId70"/>
+                          <a:blip r:embed="rId80"/>
                           <a:stretch>
                             <a:fillRect/>
                           </a:stretch>
@@ -35163,7 +36345,7 @@
                           <pic:cNvPicPr/>
                         </pic:nvPicPr>
                         <pic:blipFill>
-                          <a:blip r:embed="rId71"/>
+                          <a:blip r:embed="rId81"/>
                           <a:stretch>
                             <a:fillRect/>
                           </a:stretch>
@@ -35928,7 +37110,7 @@
                           <pic:cNvPicPr/>
                         </pic:nvPicPr>
                         <pic:blipFill>
-                          <a:blip r:embed="rId72"/>
+                          <a:blip r:embed="rId82"/>
                           <a:stretch>
                             <a:fillRect/>
                           </a:stretch>
@@ -36675,7 +37857,7 @@
                           <pic:cNvPicPr/>
                         </pic:nvPicPr>
                         <pic:blipFill>
-                          <a:blip r:embed="rId73"/>
+                          <a:blip r:embed="rId83"/>
                           <a:stretch>
                             <a:fillRect/>
                           </a:stretch>
@@ -38036,7 +39218,7 @@
     </w:p>
     <w:p/>
     <w:sectPr>
-      <w:footerReference w:type="first" r:id="rId74"/>
+      <w:footerReference w:type="first" r:id="rId84"/>
       <w:pgSz w:w="11906" w:h="16838" w:code="9"/>
       <w:pgMar w:top="2268" w:right="1701" w:bottom="1701" w:left="2268" w:header="1701" w:footer="1134" w:gutter="0"/>
       <w:cols w:space="708"/>
@@ -40829,7 +42011,6 @@
   <w:style w:type="character" w:default="1" w:styleId="DefaultParagraphFont">
     <w:name w:val="Default Paragraph Font"/>
     <w:uiPriority w:val="1"/>
-    <w:semiHidden/>
     <w:unhideWhenUsed/>
   </w:style>
   <w:style w:type="table" w:default="1" w:styleId="TableNormal">
@@ -41462,6 +42643,7 @@
     <w:rsid w:val="00332E1E"/>
     <w:rsid w:val="00360D5E"/>
     <w:rsid w:val="003E1D5D"/>
+    <w:rsid w:val="003F5FD0"/>
     <w:rsid w:val="0040131C"/>
     <w:rsid w:val="00406D1F"/>
     <w:rsid w:val="00433C9C"/>
@@ -41470,7 +42652,9 @@
     <w:rsid w:val="0047283F"/>
     <w:rsid w:val="00480116"/>
     <w:rsid w:val="004B5D0A"/>
+    <w:rsid w:val="004E18F4"/>
     <w:rsid w:val="00542E6D"/>
+    <w:rsid w:val="005454B2"/>
     <w:rsid w:val="005779A7"/>
     <w:rsid w:val="005946F6"/>
     <w:rsid w:val="00634701"/>

</xml_diff>